<commit_message>
Updated Attack Surface Analysis - Model Creation procedure / template (match threat model creation process type / class information) / fixed bad file location
</commit_message>
<xml_diff>
--- a/source/reference_documents/tertiary_documents/design/Attack Surface Analysis/model creation/Attack Surface Analysis - Model Creation.docx
+++ b/source/reference_documents/tertiary_documents/design/Attack Surface Analysis/model creation/Attack Surface Analysis - Model Creation.docx
@@ -40,7 +40,7 @@
         <w:t xml:space="preserve">Version </w:t>
       </w:r>
       <w:r>
-        <w:t>5</w:t>
+        <w:t>7</w:t>
       </w:r>
     </w:p>
     <w:p>
@@ -57,7 +57,7 @@
         <w:rPr>
           <w:noProof/>
         </w:rPr>
-        <w:t>1/16/25 9:24 AM</w:t>
+        <w:t>4/21/25 1:55 PM</w:t>
       </w:r>
       <w:r>
         <w:fldChar w:fldCharType="end"/>
@@ -3644,11 +3644,7 @@
         <w:t>. These are placed on the perimeter of the element. Communication protocols are shown</w:t>
       </w:r>
       <w:r>
-        <w:t xml:space="preserve"> </w:t>
-      </w:r>
-      <w:proofErr w:type="gramStart"/>
-      <w:r>
-        <w:t>as</w:t>
+        <w:t xml:space="preserve"> as</w:t>
       </w:r>
       <w:r>
         <w:t xml:space="preserve">  </w:t>
@@ -3661,7 +3657,6 @@
         </w:rPr>
         <w:t>blue</w:t>
       </w:r>
-      <w:proofErr w:type="gramEnd"/>
       <w:r>
         <w:t xml:space="preserve"> </w:t>
       </w:r>
@@ -4079,7 +4074,7 @@
         <w:ind w:left="360"/>
       </w:pPr>
       <w:r>
-        <w:t>RS232</w:t>
+        <w:t>Serial</w:t>
       </w:r>
     </w:p>
     <w:p>
@@ -4093,7 +4088,7 @@
         <w:ind w:left="360"/>
       </w:pPr>
       <w:r>
-        <w:t>RS422</w:t>
+        <w:t>Parallel</w:t>
       </w:r>
     </w:p>
     <w:p>
@@ -4112,6 +4107,62 @@
     </w:p>
     <w:p>
       <w:pPr>
+        <w:pStyle w:val="ListParagraph"/>
+        <w:numPr>
+          <w:ilvl w:val="0"/>
+          <w:numId w:val="8"/>
+        </w:numPr>
+        <w:spacing w:after="240"/>
+        <w:ind w:left="360"/>
+      </w:pPr>
+      <w:r>
+        <w:t>PS/2</w:t>
+      </w:r>
+    </w:p>
+    <w:p>
+      <w:pPr>
+        <w:pStyle w:val="ListParagraph"/>
+        <w:numPr>
+          <w:ilvl w:val="0"/>
+          <w:numId w:val="8"/>
+        </w:numPr>
+        <w:spacing w:after="240"/>
+        <w:ind w:left="360"/>
+      </w:pPr>
+      <w:r>
+        <w:t>Video</w:t>
+      </w:r>
+    </w:p>
+    <w:p>
+      <w:pPr>
+        <w:pStyle w:val="ListParagraph"/>
+        <w:numPr>
+          <w:ilvl w:val="0"/>
+          <w:numId w:val="8"/>
+        </w:numPr>
+        <w:spacing w:after="240"/>
+        <w:ind w:left="360"/>
+      </w:pPr>
+      <w:r>
+        <w:t>Audio</w:t>
+      </w:r>
+    </w:p>
+    <w:p>
+      <w:pPr>
+        <w:pStyle w:val="ListParagraph"/>
+        <w:numPr>
+          <w:ilvl w:val="0"/>
+          <w:numId w:val="8"/>
+        </w:numPr>
+        <w:spacing w:after="240"/>
+        <w:ind w:left="360"/>
+      </w:pPr>
+      <w:r>
+        <w:t>other</w:t>
+      </w:r>
+    </w:p>
+    <w:p>
+      <w:pPr>
         <w:spacing w:after="240"/>
         <w:ind w:left="810" w:hanging="810"/>
         <w:jc w:val="both"/>
@@ -4157,6 +4208,7 @@
         <w:pStyle w:val="Heading3"/>
       </w:pPr>
       <w:r>
+        <w:lastRenderedPageBreak/>
         <w:t>Description</w:t>
       </w:r>
     </w:p>
@@ -4179,7 +4231,6 @@
         <w:pStyle w:val="Heading3"/>
       </w:pPr>
       <w:r>
-        <w:lastRenderedPageBreak/>
         <w:t>Purpose</w:t>
       </w:r>
     </w:p>
@@ -4819,9 +4870,9 @@
           <w:noProof/>
         </w:rPr>
         <w:drawing>
-          <wp:inline distT="0" distB="0" distL="0" distR="0" wp14:anchorId="1F5E63E1" wp14:editId="64FE52E0">
-            <wp:extent cx="5943600" cy="2355850"/>
-            <wp:effectExtent l="0" t="0" r="0" b="6350"/>
+          <wp:inline distT="0" distB="0" distL="0" distR="0" wp14:anchorId="1F5E63E1" wp14:editId="67564503">
+            <wp:extent cx="5943600" cy="1091138"/>
+            <wp:effectExtent l="0" t="0" r="0" b="1270"/>
             <wp:docPr id="287466162" name="Picture 2"/>
             <wp:cNvGraphicFramePr>
               <a:graphicFrameLocks xmlns:a="http://schemas.openxmlformats.org/drawingml/2006/main" noChangeAspect="1"/>
@@ -4830,7 +4881,7 @@
               <a:graphicData uri="http://schemas.openxmlformats.org/drawingml/2006/picture">
                 <pic:pic xmlns:pic="http://schemas.openxmlformats.org/drawingml/2006/picture">
                   <pic:nvPicPr>
-                    <pic:cNvPr id="287466162" name="Picture 287466162"/>
+                    <pic:cNvPr id="287466162" name="Picture 2"/>
                     <pic:cNvPicPr/>
                   </pic:nvPicPr>
                   <pic:blipFill>
@@ -4842,7 +4893,7 @@
                   <pic:spPr>
                     <a:xfrm>
                       <a:off x="0" y="0"/>
-                      <a:ext cx="5943600" cy="2355850"/>
+                      <a:ext cx="5943600" cy="1091138"/>
                     </a:xfrm>
                     <a:prstGeom prst="rect">
                       <a:avLst/>
@@ -4915,7 +4966,7 @@
         <w:ind w:left="360"/>
       </w:pPr>
       <w:r>
-        <w:t>kernel</w:t>
+        <w:t>Process</w:t>
       </w:r>
     </w:p>
     <w:p>
@@ -4929,7 +4980,7 @@
         <w:ind w:left="360"/>
       </w:pPr>
       <w:r>
-        <w:t>service / daemon</w:t>
+        <w:t>Driver</w:t>
       </w:r>
     </w:p>
     <w:p>
@@ -4943,7 +4994,53 @@
         <w:ind w:left="360"/>
       </w:pPr>
       <w:r>
-        <w:t>system</w:t>
+        <w:t>S</w:t>
+      </w:r>
+      <w:r>
+        <w:t xml:space="preserve">ervice / </w:t>
+      </w:r>
+      <w:r>
+        <w:t>D</w:t>
+      </w:r>
+      <w:r>
+        <w:t>aemon</w:t>
+      </w:r>
+      <w:r>
+        <w:t xml:space="preserve"> </w:t>
+      </w:r>
+    </w:p>
+    <w:p>
+      <w:pPr>
+        <w:pStyle w:val="Heading3"/>
+      </w:pPr>
+      <w:r>
+        <w:t xml:space="preserve">Process </w:t>
+      </w:r>
+      <w:r>
+        <w:t>Class</w:t>
+      </w:r>
+    </w:p>
+    <w:p>
+      <w:pPr>
+        <w:spacing w:after="240"/>
+      </w:pPr>
+      <w:r>
+        <w:t xml:space="preserve">This is the </w:t>
+      </w:r>
+      <w:r>
+        <w:t>owner of the process.</w:t>
+      </w:r>
+      <w:r>
+        <w:t xml:space="preserve"> </w:t>
+      </w:r>
+      <w:r>
+        <w:t xml:space="preserve">Process </w:t>
+      </w:r>
+      <w:r>
+        <w:t>classes</w:t>
+      </w:r>
+      <w:r>
+        <w:t xml:space="preserve"> include:</w:t>
       </w:r>
     </w:p>
     <w:p>
@@ -4957,26 +5054,49 @@
         <w:ind w:left="360"/>
       </w:pPr>
       <w:r>
-        <w:t>user</w:t>
-      </w:r>
-    </w:p>
-    <w:p>
-      <w:pPr>
-        <w:pStyle w:val="Heading3"/>
-      </w:pPr>
-      <w:r>
-        <w:t>Process Owner</w:t>
-      </w:r>
-    </w:p>
-    <w:p>
-      <w:pPr>
-        <w:spacing w:after="240"/>
-      </w:pPr>
-      <w:r>
-        <w:t xml:space="preserve">This is the </w:t>
-      </w:r>
-      <w:r>
-        <w:t>ACL owner of the process.</w:t>
+        <w:t>OS</w:t>
+      </w:r>
+    </w:p>
+    <w:p>
+      <w:pPr>
+        <w:pStyle w:val="ListParagraph"/>
+        <w:numPr>
+          <w:ilvl w:val="0"/>
+          <w:numId w:val="8"/>
+        </w:numPr>
+        <w:spacing w:after="240"/>
+        <w:ind w:left="360"/>
+      </w:pPr>
+      <w:r>
+        <w:t>Third-party</w:t>
+      </w:r>
+    </w:p>
+    <w:p>
+      <w:pPr>
+        <w:pStyle w:val="ListParagraph"/>
+        <w:numPr>
+          <w:ilvl w:val="0"/>
+          <w:numId w:val="8"/>
+        </w:numPr>
+        <w:spacing w:after="240"/>
+        <w:ind w:left="360"/>
+      </w:pPr>
+      <w:r>
+        <w:t>Self</w:t>
+      </w:r>
+    </w:p>
+    <w:p>
+      <w:pPr>
+        <w:pStyle w:val="ListParagraph"/>
+        <w:numPr>
+          <w:ilvl w:val="0"/>
+          <w:numId w:val="8"/>
+        </w:numPr>
+        <w:spacing w:after="240"/>
+        <w:ind w:left="360"/>
+      </w:pPr>
+      <w:r>
+        <w:t>External</w:t>
       </w:r>
     </w:p>
     <w:p>
@@ -5094,8 +5214,8 @@
           <w:noProof/>
         </w:rPr>
         <w:drawing>
-          <wp:inline distT="0" distB="0" distL="0" distR="0" wp14:anchorId="0E12EA0E" wp14:editId="0B51E7DD">
-            <wp:extent cx="5943600" cy="4107180"/>
+          <wp:inline distT="0" distB="0" distL="0" distR="0" wp14:anchorId="0E12EA0E" wp14:editId="786C3A4C">
+            <wp:extent cx="5943600" cy="3441743"/>
             <wp:effectExtent l="0" t="0" r="0" b="0"/>
             <wp:docPr id="1224693589" name="Picture 6"/>
             <wp:cNvGraphicFramePr>
@@ -5105,7 +5225,7 @@
               <a:graphicData uri="http://schemas.openxmlformats.org/drawingml/2006/picture">
                 <pic:pic xmlns:pic="http://schemas.openxmlformats.org/drawingml/2006/picture">
                   <pic:nvPicPr>
-                    <pic:cNvPr id="1224693589" name="Picture 1224693589"/>
+                    <pic:cNvPr id="1224693589" name="Picture 6"/>
                     <pic:cNvPicPr/>
                   </pic:nvPicPr>
                   <pic:blipFill>
@@ -5117,7 +5237,7 @@
                   <pic:spPr>
                     <a:xfrm>
                       <a:off x="0" y="0"/>
-                      <a:ext cx="5943600" cy="4107180"/>
+                      <a:ext cx="5943600" cy="3441743"/>
                     </a:xfrm>
                     <a:prstGeom prst="rect">
                       <a:avLst/>

</xml_diff>

<commit_message>
Updated the Attack Surface Analysis - Model Creation tertiary document (removed extraneous note)
</commit_message>
<xml_diff>
--- a/source/reference_documents/tertiary_documents/design/Attack Surface Analysis/model creation/Attack Surface Analysis - Model Creation.docx
+++ b/source/reference_documents/tertiary_documents/design/Attack Surface Analysis/model creation/Attack Surface Analysis - Model Creation.docx
@@ -40,7 +40,7 @@
         <w:t xml:space="preserve">Version </w:t>
       </w:r>
       <w:r>
-        <w:t>7</w:t>
+        <w:t>8</w:t>
       </w:r>
     </w:p>
     <w:p>
@@ -57,7 +57,7 @@
         <w:rPr>
           <w:noProof/>
         </w:rPr>
-        <w:t>4/21/25 1:55 PM</w:t>
+        <w:t>1/26/26 2:46 PM</w:t>
       </w:r>
       <w:r>
         <w:fldChar w:fldCharType="end"/>
@@ -2479,121 +2479,6 @@
     </w:p>
     <w:p>
       <w:pPr>
-        <w:pStyle w:val="FirstParagraph"/>
-        <w:spacing w:line="276" w:lineRule="auto"/>
-        <w:ind w:left="810" w:hanging="810"/>
-        <w:jc w:val="both"/>
-        <w:rPr>
-          <w:rFonts w:ascii="Arial" w:hAnsi="Arial" w:cs="Arial"/>
-          <w:sz w:val="22"/>
-          <w:szCs w:val="22"/>
-        </w:rPr>
-      </w:pPr>
-      <w:r>
-        <w:rPr>
-          <w:rFonts w:ascii="Arial" w:hAnsi="Arial" w:cs="Arial"/>
-          <w:b/>
-          <w:bCs/>
-          <w:color w:val="0070C0"/>
-          <w:sz w:val="22"/>
-          <w:szCs w:val="22"/>
-        </w:rPr>
-        <w:t>Note</w:t>
-      </w:r>
-      <w:r>
-        <w:rPr>
-          <w:rFonts w:ascii="Arial" w:hAnsi="Arial" w:cs="Arial"/>
-          <w:b/>
-          <w:bCs/>
-          <w:color w:val="0070C0"/>
-          <w:sz w:val="22"/>
-          <w:szCs w:val="22"/>
-        </w:rPr>
-        <w:t>:</w:t>
-      </w:r>
-      <w:r>
-        <w:rPr>
-          <w:rFonts w:ascii="Arial" w:hAnsi="Arial" w:cs="Arial"/>
-          <w:sz w:val="22"/>
-          <w:szCs w:val="22"/>
-        </w:rPr>
-        <w:tab/>
-      </w:r>
-      <w:r>
-        <w:rPr>
-          <w:rFonts w:ascii="Arial" w:hAnsi="Arial" w:cs="Arial"/>
-          <w:sz w:val="22"/>
-          <w:szCs w:val="22"/>
-        </w:rPr>
-        <w:t>Only one of the sections (2, 3, 4) will be used for any given model creation</w:t>
-      </w:r>
-      <w:r>
-        <w:rPr>
-          <w:rFonts w:ascii="Arial" w:hAnsi="Arial" w:cs="Arial"/>
-          <w:sz w:val="22"/>
-          <w:szCs w:val="22"/>
-        </w:rPr>
-        <w:t>.</w:t>
-      </w:r>
-      <w:r>
-        <w:rPr>
-          <w:rFonts w:ascii="Arial" w:hAnsi="Arial" w:cs="Arial"/>
-          <w:sz w:val="22"/>
-          <w:szCs w:val="22"/>
-        </w:rPr>
-        <w:t xml:space="preserve"> This </w:t>
-      </w:r>
-      <w:r>
-        <w:rPr>
-          <w:rFonts w:ascii="Arial" w:hAnsi="Arial" w:cs="Arial"/>
-          <w:sz w:val="22"/>
-          <w:szCs w:val="22"/>
-        </w:rPr>
-        <w:t>was</w:t>
-      </w:r>
-      <w:r>
-        <w:rPr>
-          <w:rFonts w:ascii="Arial" w:hAnsi="Arial" w:cs="Arial"/>
-          <w:sz w:val="22"/>
-          <w:szCs w:val="22"/>
-        </w:rPr>
-        <w:t xml:space="preserve"> discussed in greater depth in the </w:t>
-      </w:r>
-      <w:hyperlink w:anchor="_Model_Creation_Methodology" w:history="1">
-        <w:r>
-          <w:rPr>
-            <w:rStyle w:val="Hyperlink"/>
-            <w:rFonts w:ascii="Arial" w:hAnsi="Arial" w:cs="Arial"/>
-            <w:b/>
-            <w:bCs/>
-            <w:sz w:val="22"/>
-            <w:szCs w:val="22"/>
-          </w:rPr>
-          <w:t>Analysis</w:t>
-        </w:r>
-        <w:r>
-          <w:rPr>
-            <w:rStyle w:val="Hyperlink"/>
-            <w:rFonts w:ascii="Arial" w:hAnsi="Arial" w:cs="Arial"/>
-            <w:b/>
-            <w:bCs/>
-            <w:sz w:val="22"/>
-            <w:szCs w:val="22"/>
-          </w:rPr>
-          <w:t xml:space="preserve"> Methodology</w:t>
-        </w:r>
-      </w:hyperlink>
-      <w:r>
-        <w:rPr>
-          <w:rFonts w:ascii="Arial" w:hAnsi="Arial" w:cs="Arial"/>
-          <w:sz w:val="22"/>
-          <w:szCs w:val="22"/>
-        </w:rPr>
-        <w:t xml:space="preserve"> section of this document.</w:t>
-      </w:r>
-    </w:p>
-    <w:p>
-      <w:pPr>
         <w:rPr>
           <w:color w:val="0070C0"/>
           <w:sz w:val="32"/>
@@ -5034,13 +4919,7 @@
         <w:t xml:space="preserve"> </w:t>
       </w:r>
       <w:r>
-        <w:t xml:space="preserve">Process </w:t>
-      </w:r>
-      <w:r>
-        <w:t>classes</w:t>
-      </w:r>
-      <w:r>
-        <w:t xml:space="preserve"> include:</w:t>
+        <w:t>Process classes include:</w:t>
       </w:r>
     </w:p>
     <w:p>
@@ -7474,6 +7353,18 @@
     <w:unhideWhenUsed/>
     <w:rsid w:val="00C304A7"/>
   </w:style>
+  <w:style w:type="character" w:styleId="FollowedHyperlink">
+    <w:name w:val="FollowedHyperlink"/>
+    <w:basedOn w:val="DefaultParagraphFont"/>
+    <w:uiPriority w:val="99"/>
+    <w:semiHidden/>
+    <w:unhideWhenUsed/>
+    <w:rsid w:val="00881C94"/>
+    <w:rPr>
+      <w:color w:val="800080" w:themeColor="followedHyperlink"/>
+      <w:u w:val="single"/>
+    </w:rPr>
+  </w:style>
 </w:styles>
 </file>
 

</xml_diff>